<commit_message>
Book 3: split semiconductor series roadmap
</commit_message>
<xml_diff>
--- a/EE - SERIES/Semiconductor_Physics_and_Devices_Book3.docx
+++ b/EE - SERIES/Semiconductor_Physics_and_Devices_Book3.docx
@@ -98,26 +98,25 @@
     </w:p>
     <w:p>
       <w:r>
-        <w:rPr>
-          <w:rFonts w:eastAsia="Calibri"/>
-        </w:rPr>
-        <w:t xml:space="preserve">Part II takes up the bipolar transistor and Part III the MOSFET, down to the fin and the nanosheet. Part IV builds the op-amp of Book 2 from those transistors and derives the noise they make. Part V treats CMOS as a chip: gate delay and power, memory cells, and the failures that end a chip's life. Part VI turns the junction into a source and detector of light and into a high-voltage switch. Part VII follows a transistor through the fab, builds the piezoelectric thin films and acoustic resonators behind every phone's filters, and explains the compact models and process design kits that carry all of these devices into a simulator. Part VIII reads data sheets into SPICE models and shows why every model is a fit and not the truth. Part IX widens the range: the materials that compete with silicon for speed, voltage, and heat, lasers and single-photon detectors and image pixels, sensing devices from MEMS to quantum, and the economics of turning any of it into an ASIC or an FPGA design. The circuit check for Parts II to IV is Tietze, Schenk, and Gamm, </w:t>
-      </w:r>
-      <w:hyperlink r:id="rId6" w:history="1">
-        <w:r>
-          <w:rPr>
-            <w:rFonts w:eastAsia="Calibri"/>
-            <w:color w:val="0563C1"/>
-            <w:u w:val="single"/>
-          </w:rPr>
-          <w:t>Halbleiter-Schaltungstechnik</w:t>
-        </w:r>
-      </w:hyperlink>
-      <w:r>
-        <w:rPr>
-          <w:rFonts w:eastAsia="Calibri"/>
-        </w:rPr>
-        <w:t>, 16th edition (2019), whose op-amp chapter was rewritten for that edition. High-speed boards, radio layout, switching regulators, and software-defined radio are later books in this series, named in Appendix C so this book does not pretend to cover them.</w:t>
+        <w:t>Part II takes up the bipolar transistor and Part III the MOSFET, down to the fin and the nanosheet. Part IV builds the op-amp of Book 2 from those transistors and derives the noise they make.</w:t>
+      </w:r>
+    </w:p>
+    <w:p>
+      <w:pPr/>
+      <w:r>
+        <w:t>Part V treats CMOS as a chip: gate delay and power, memory cells, and the failures that end a chip's life. Part VI turns the junction into a source and detector of light and into a high-voltage switch. Part VII follows a transistor through the fab, builds the piezoelectric thin films and acoustic resonators behind every phone's filters, and explains the compact models and process design kits that carry these devices into a simulator. Part VIII reads data sheets into SPICE models and shows why every model is a fit, not the truth.</w:t>
+      </w:r>
+    </w:p>
+    <w:p>
+      <w:pPr/>
+      <w:r>
+        <w:t>Part IX widens the range: materials that compete with silicon for speed, voltage, and heat; lasers, single-photon detectors, and image pixels; sensing devices from MEMS to quantum; and the economics of turning any of it into an ASIC or FPGA design.</w:t>
+      </w:r>
+    </w:p>
+    <w:p>
+      <w:pPr/>
+      <w:r>
+        <w:t>For the circuit treatment in Parts II to IV, the reference is Tietze, Schenk, and Gamm, Halbleiter-Schaltungstechnik, 16th edition (2019), whose op-amp chapter was rewritten for that edition. High-speed boards, radio layout, switching regulators, and software-defined radio are covered in later books in this series, listed in Appendix C.</w:t>
       </w:r>
     </w:p>
     <w:p>

</xml_diff>

<commit_message>
Book 3: qualify material claims and clean sources; DOCX rebuilt
</commit_message>
<xml_diff>
--- a/EE - SERIES/Semiconductor_Physics_and_Devices_Book3.docx
+++ b/EE - SERIES/Semiconductor_Physics_and_Devices_Book3.docx
@@ -15088,7 +15088,7 @@
         <w:spacing w:after="60"/>
       </w:pPr>
       <w:r>
-        <w:t>Diamond: 5.5 eV; about 10 MV/cm; up to about 4,500 cm²/V·s in the purest crystals; 5.7; about 2.3×10⁷ cm/s; 2,290 to 3,450 W/m·K, the highest of any material.</w:t>
+        <w:t>Diamond: 5.5 eV; about 10 MV/cm; up to about 4,500 cm²/V·s in the purest crystals; 5.7; about 2.3×10⁷ cm/s; 2,290 to 3,450 W/m·K, the highest in this comparison for bulk semiconductor crystals.</w:t>
       </w:r>
     </w:p>
     <w:p>
@@ -15369,15 +15369,15 @@
         <w:rPr>
           <w:rFonts w:eastAsia="Calibri"/>
         </w:rPr>
-        <w:t>Gallium oxide has the attraction of melt growth: large single-crystal wafers can be pulled from a melt, as for silicon and sapphire, which SiC and GaN cannot do. Its n-type doping is controllable, and Schottky diodes and transistors blocking more than a kilovolt have been reported. It has two deep weaknesses. No usable p-type doping exists, so there is no pn junction, no conventional MOSFET body, and no bipolar device. And its thermal conductivity is the lowest in the list, so heat must leave through the top surface, through thinned wafers, or through a bonded layer of a better conductor.</w:t>
-      </w:r>
-    </w:p>
-    <w:p>
-      <w:r>
-        <w:rPr>
-          <w:rFonts w:eastAsia="Calibri"/>
-        </w:rPr>
-        <w:t>Diamond has the opposite profile: the best thermal conductivity of any material, a high critical field, and high mobilities for both carriers, but its dopants sit deep in the gap, boron about 0.37 eV above the valence band and phosphorus about 0.6 eV below the conduction band, so only a small fraction of them is ionized at room temperature. Devices use hydrogen-terminated surfaces, which form a hole channel without dopants, or very thin, heavily doped layers. Wafers are small and expensive. Diamond's most practical electronic role today is as a heat spreader under GaN, and its most exciting one is the quantum sensor of Chapter 27.</w:t>
+        <w:t>Gallium oxide has the attraction of melt growth: large single-crystal wafers can be pulled from a melt, as for silicon and sapphire, which SiC and GaN cannot do. Its n-type doping is controllable, and Schottky diodes and transistors blocking more than a kilovolt have been reported. Its key limitation is p-type material: reports of hole conductivity exist, but reliable, controllable, device-quality layers remain difficult to make. Conventional homojunction pn devices and p-channel structures therefore remain research challenges; heterojunctions using a different p-type semiconductor are a separate possibility. Its thermal conductivity is the lowest in this comparison, so heat must leave through the top surface, a thinned wafer, or a bonded layer of a better conductor.</w:t>
+      </w:r>
+    </w:p>
+    <w:p>
+      <w:r>
+        <w:rPr>
+          <w:rFonts w:eastAsia="Calibri"/>
+        </w:rPr>
+        <w:t>Diamond has the opposite profile: among crystalline semiconductors, it has one of the highest thermal conductivities, a high critical field, and high mobilities for both carriers, but its dopants sit deep in the gap, boron about 0.37 eV above the valence band and phosphorus about 0.6 eV below the conduction band, so only a small fraction of them is ionized at room temperature. Devices use hydrogen-terminated surfaces, which form a hole channel without dopants, or very thin, heavily doped layers. Wafers are small and expensive. Diamond's most practical electronic role today is as a heat spreader under GaN, and its most exciting one is the quantum sensor of Chapter 27.</w:t>
       </w:r>
     </w:p>
     <w:p>
@@ -20432,13 +20432,12 @@
           <w:rFonts w:eastAsia="Calibri"/>
           <w:b/>
         </w:rPr>
-        <w:t xml:space="preserve">5. </w:t>
-      </w:r>
-      <w:r>
-        <w:rPr>
-          <w:rFonts w:eastAsia="Calibri"/>
-        </w:rPr>
-        <w:t>Idea: a pn junction needs both carrier types. Ga2O3 has no usable p-type doping, so there is no pn junction, no inversion-channel MOSFET body, and no bipolar device; designers use Schottky barriers, depletion-mode and fin transistors, or junctions with other p-type materials. Even a Schottky diode is limited by heat: with 11 to 27 W/m·K, a tenth of SiC's conductivity, the junction temperature rises quickly at high current density, so the die must be thinned, cooled from the top, or bonded to a better conductor. The usual mistake is to read the Baliga figure as a forecast of real device performance.</w:t>
+        <w:t>5. Idea: a pn junction needs both carrier types. Reports of hole conductivity in Ga2O3 exist, but mature, controllable, device-quality p-type layers remain a challenge. Conventional homojunction pn devices and p-channel structures are therefore research problems. Designers can instead use Schottky barriers, depletion-mode and fin transistors, or heterojunctions with other p-type materials. Even a Schottky diode is limited by heat: with 11 to 27 W/m·K, a tenth of SiC's conductivity, the junction temperature rises quickly at high current density, so the die must be thinned, cooled from the top, or bonded to a better conductor. The usual mistake is to read the Baliga figure as a forecast of real device performance.</w:t>
+      </w:r>
+      <w:r>
+        <w:rPr>
+          <w:rFonts w:eastAsia="Calibri"/>
+        </w:rPr>
       </w:r>
     </w:p>
     <w:p>
@@ -21540,7 +21539,10 @@
         <w:rPr>
           <w:rFonts w:eastAsia="Calibri"/>
         </w:rPr>
-        <w:t>Tsao et al., "</w:t>
+        <w:t>Tsao et al., "Ultrawide-Bandgap Semiconductors: Research Opportunities and Challenges" (Advanced Electronic Materials, 2018); Woo et al., "From Wide to Ultrawide-Bandgap Semiconductors for High Power and High Frequency Electronic Devices" (Journal of Physics: Materials, 2024); Park et al., "P-type conductivity in oxygen-rich β-Ga2O3 thin films" (Materials Science in Semiconductor Processing, 2025), https://doi.org/10.1016/j.mssp.2025.110003; Coldren, Corzine, and Mašanović, Diode Lasers and Photonic Integrated Circuits; McIntyre, "Multiplication Noise in Uniform Avalanche Diodes" (IEEE Transactions on Electron Devices, 1966); Ohta, Smart CMOS Image Sensors and Applications; Gallego et al., "Event-Based Vision: A Survey" (IEEE Transactions on Pattern Analysis and Machine Intelligence, 2022); Shockley and Queisser, "Detailed Balance Limit of Efficiency of p-n Junction Solar Cells" (Journal of Applied Physics, 1961); Kaajakari, Practical MEMS; Popović, Hall Effect Devices; Schirhagl et al., "Nitrogen-Vacancy Centers in Diamond: Nanoscale Sensors for Physics and Biology" (Annual Review of Physical Chemistry, 2014); Weste and Harris (Part V) for the ASIC flow; the Tiny Tapeout project pages. Iveland et al., "Direct Measurement of Auger Electrons Emitted from a Semiconductor Light-Emitting Diode under Electrical Injection" (Physical Review Letters, 2013), and Xie et al., "Effect of Carrier Spillover and Auger Recombination on the Efficiency Droop in InGaN-Based Blue LEDs" (Superlattices and Microstructures, 2010), for Chapter 26 LED droop; Uoyama et al., "Highly Efficient Organic Light-Emitting Diodes from Delayed Fluorescence" (Nature, 2012), for OLED triplet harvesting and TADF.</w:t>
+      </w:r>
+      <w:r>
+        <w:t xml:space="preserve"> Further links: </w:t>
       </w:r>
       <w:hyperlink r:id="rId78" w:history="1">
         <w:r>
@@ -21556,7 +21558,7 @@
         <w:rPr>
           <w:rFonts w:eastAsia="Calibri"/>
         </w:rPr>
-        <w:t>" (Advanced Electronic Materials, 2018); Woo et al., "</w:t>
+        <w:t xml:space="preserve">; </w:t>
       </w:r>
       <w:hyperlink r:id="rId79" w:history="1">
         <w:r>
@@ -21572,7 +21574,7 @@
         <w:rPr>
           <w:rFonts w:eastAsia="Calibri"/>
         </w:rPr>
-        <w:t xml:space="preserve">" (Journal of Physics: Materials, 2024); Coldren, Corzine, and Mašanović, </w:t>
+        <w:t xml:space="preserve">; </w:t>
       </w:r>
       <w:hyperlink r:id="rId80" w:history="1">
         <w:r>
@@ -21588,7 +21590,7 @@
         <w:rPr>
           <w:rFonts w:eastAsia="Calibri"/>
         </w:rPr>
-        <w:t>; McIntyre, "</w:t>
+        <w:t xml:space="preserve">; </w:t>
       </w:r>
       <w:hyperlink r:id="rId81" w:history="1">
         <w:r>
@@ -21604,7 +21606,7 @@
         <w:rPr>
           <w:rFonts w:eastAsia="Calibri"/>
         </w:rPr>
-        <w:t xml:space="preserve">" (IEEE Transactions on Electron Devices, 1966); Ohta, </w:t>
+        <w:t xml:space="preserve">; </w:t>
       </w:r>
       <w:hyperlink r:id="rId82" w:history="1">
         <w:r>
@@ -21620,7 +21622,7 @@
         <w:rPr>
           <w:rFonts w:eastAsia="Calibri"/>
         </w:rPr>
-        <w:t>; Gallego et al., "</w:t>
+        <w:t xml:space="preserve">; </w:t>
       </w:r>
       <w:hyperlink r:id="rId83" w:history="1">
         <w:r>
@@ -21636,7 +21638,7 @@
         <w:rPr>
           <w:rFonts w:eastAsia="Calibri"/>
         </w:rPr>
-        <w:t>" (IEEE Transactions on Pattern Analysis and Machine Intelligence, 2022); Shockley and Queisser, "</w:t>
+        <w:t xml:space="preserve">; </w:t>
       </w:r>
       <w:hyperlink r:id="rId84" w:history="1">
         <w:r>
@@ -21652,7 +21654,7 @@
         <w:rPr>
           <w:rFonts w:eastAsia="Calibri"/>
         </w:rPr>
-        <w:t xml:space="preserve">" (Journal of Applied Physics, 1961); Kaajakari, </w:t>
+        <w:t xml:space="preserve">; </w:t>
       </w:r>
       <w:hyperlink r:id="rId85" w:history="1">
         <w:r>
@@ -21668,7 +21670,7 @@
         <w:rPr>
           <w:rFonts w:eastAsia="Calibri"/>
         </w:rPr>
-        <w:t xml:space="preserve">; Popović, </w:t>
+        <w:t xml:space="preserve">; </w:t>
       </w:r>
       <w:hyperlink r:id="rId86" w:history="1">
         <w:r>
@@ -21684,7 +21686,7 @@
         <w:rPr>
           <w:rFonts w:eastAsia="Calibri"/>
         </w:rPr>
-        <w:t>; Schirhagl et al., "</w:t>
+        <w:t xml:space="preserve">; </w:t>
       </w:r>
       <w:hyperlink r:id="rId87" w:history="1">
         <w:r>
@@ -21700,7 +21702,7 @@
         <w:rPr>
           <w:rFonts w:eastAsia="Calibri"/>
         </w:rPr>
-        <w:t xml:space="preserve">" (Annual Review of Physical Chemistry, 2014); Weste and Harris (Part V) for the ASIC flow; the </w:t>
+        <w:t xml:space="preserve">; </w:t>
       </w:r>
       <w:hyperlink r:id="rId88" w:history="1">
         <w:r>
@@ -21716,11 +21718,8 @@
         <w:rPr>
           <w:rFonts w:eastAsia="Calibri"/>
         </w:rPr>
-        <w:t>.</w:t>
-      </w:r>
-      <w:r>
-        <w:t xml:space="preserve"> Iveland et al., "Direct Measurement of Auger Electrons Emitted from a Semiconductor Light-Emitting Diode under Electrical Injection" (Physical Review Letters, 2013), and Xie et al., "Effect of Carrier Spillover and Auger Recombination on the Efficiency Droop in InGaN-Based Blue LEDs" (Superlattices and Microstructures, 2010), for Chapter 26 LED droop; Uoyama et al., "Highly Efficient Organic Light-Emitting Diodes from Delayed Fluorescence" (Nature, 2012), for OLED triplet harvesting and TADF.</w:t>
-      </w:r>
+      </w:r>
+      <w:r/>
     </w:p>
     <w:p>
       <w:pPr>

</xml_diff>